<commit_message>
Aufgabe B (Kundenberechnungen) vollstaendig ausgebaut: Dedizierte Energiekostenkalkulation.xlsx, Speicherplatzberechnung.xlsx, offizielle Dokumentation (DOCX/PDF), Querverweise in Lastenheft und Angebot ergaenzt
</commit_message>
<xml_diff>
--- a/docs/02_Anforderungsanalyse/Lastenheft.docx
+++ b/docs/02_Anforderungsanalyse/Lastenheft.docx
@@ -479,6 +479,54 @@
     </w:p>
     <w:p>
       <w:pPr>
+        <w:spacing w:before="240" w:after="80"/>
+      </w:pPr>
+      <w:r>
+        <w:rPr>
+          <w:rFonts w:ascii="Calibri" w:hAnsi="Calibri"/>
+          <w:b/>
+          <w:color w:val="1F497D"/>
+          <w:sz w:val="24"/>
+        </w:rPr>
+        <w:t>5.3 Infrastruktur- und Kapazitätsvorgaben (Kundenberechnungen Aufgabe B)</w:t>
+      </w:r>
+    </w:p>
+    <w:p>
+      <w:pPr>
+        <w:spacing w:after="80"/>
+      </w:pPr>
+      <w:r>
+        <w:rPr>
+          <w:rFonts w:ascii="Calibri" w:hAnsi="Calibri"/>
+          <w:sz w:val="20"/>
+        </w:rPr>
+        <w:t>• Zentraler Fileserver-Speicherplatzbedarf (Aufgabe B.1):</w:t>
+        <w:br/>
+        <w:t xml:space="preserve">  Auf Basis des täglichen Datenaufkommens von 350 MiB pro Arbeitsplatz über 65 Arbeitstage (Quartal 1)   wurde ein Netto-Bedarf von 356 GiB (364.000 MiB ÷ 1.024) ermittelt. Unter Berücksichtigung eines   Sicherheits- und Revisionszuschlags von 25 % (+ 89 GiB) muss der zentrale Fileserver eine freie   Nettokapazität von mindestens 445 GiB für das erste Quartal bereitstellen.</w:t>
+      </w:r>
+    </w:p>
+    <w:p>
+      <w:pPr>
+        <w:spacing w:after="160"/>
+      </w:pPr>
+      <w:r>
+        <w:rPr>
+          <w:rFonts w:ascii="Calibri" w:hAnsi="Calibri"/>
+          <w:sz w:val="20"/>
+        </w:rPr>
+        <w:t>• Elektrische Leistungsaufnahme &amp; Energieeffizienz (Aufgabe B.2):</w:t>
+        <w:br/>
+        <w:t xml:space="preserve">  - Standard-Arbeitsplatz: Maximal 140 W Leistungsaufnahme (Desktop-PC inkl. zweier 27'' WQHD-Monitore).</w:t>
+        <w:br/>
+        <w:t xml:space="preserve">  - CAD/BIM-Workstation: Maximal 320 W Leistungsaufnahme (Workstation unter Volllast inkl. zweier 27'' WQHD-Monitore).</w:t>
+        <w:br/>
+        <w:t xml:space="preserve">  - Gesamtanschlussleistung des Planungsbüros: 12 × 140 W + 4 × 320 W = 2.960 W (2,96 kW).</w:t>
+        <w:br/>
+        <w:t xml:space="preserve">  - Jährlicher Energieverbrauch: 5.535,2 kWh/a (bei 220 AT à 8,5 h), resultierend in jährlichen Energiekosten von 1.771,26 € (bei 0,32 €/kWh). Alle Geräte müssen Energy-Star- und EPEAT-zertifiziert sein.</w:t>
+      </w:r>
+    </w:p>
+    <w:p>
+      <w:pPr>
         <w:pStyle w:val="Heading1"/>
       </w:pPr>
       <w:r>

</xml_diff>